<commit_message>
Update metrics Word spec doc with 6 Policy & Governance metrics
</commit_message>
<xml_diff>
--- a/Observability_Metrics_Threshold_Limits.docx
+++ b/Observability_Metrics_Threshold_Limits.docx
@@ -7669,6 +7669,900 @@
                 <w:sz w:val="17"/>
               </w:rPr>
               <w:t>&lt; 200 conns</w:t>
+            </w:r>
+          </w:p>
+        </w:tc>
+      </w:tr>
+      <w:tr>
+        <w:tc>
+          <w:tcPr>
+            <w:tcW w:type="dxa" w:w="1728"/>
+            <w:shd w:fill="F9FBFD"/>
+            <w:tcMar>
+              <w:top w:w="80" w:type="dxa"/>
+              <w:bottom w:w="80" w:type="dxa"/>
+              <w:left w:w="100" w:type="dxa"/>
+              <w:right w:w="100" w:type="dxa"/>
+            </w:tcMar>
+          </w:tcPr>
+          <w:p>
+            <w:pPr>
+              <w:jc w:val="left"/>
+            </w:pPr>
+            <w:r>
+              <w:rPr>
+                <w:color w:val="2C3E50"/>
+                <w:sz w:val="17"/>
+              </w:rPr>
+              <w:t>Policy &amp; Governance</w:t>
+            </w:r>
+          </w:p>
+        </w:tc>
+        <w:tc>
+          <w:tcPr>
+            <w:tcW w:type="dxa" w:w="1872"/>
+            <w:shd w:fill="F9FBFD"/>
+            <w:tcMar>
+              <w:top w:w="80" w:type="dxa"/>
+              <w:bottom w:w="80" w:type="dxa"/>
+              <w:left w:w="100" w:type="dxa"/>
+              <w:right w:w="100" w:type="dxa"/>
+            </w:tcMar>
+          </w:tcPr>
+          <w:p>
+            <w:pPr>
+              <w:jc w:val="left"/>
+            </w:pPr>
+            <w:r>
+              <w:rPr>
+                <w:color w:val="2C3E50"/>
+                <w:sz w:val="17"/>
+              </w:rPr>
+              <w:t>Cloud Armor Blocked Requests</w:t>
+            </w:r>
+          </w:p>
+        </w:tc>
+        <w:tc>
+          <w:tcPr>
+            <w:tcW w:type="dxa" w:w="2880"/>
+            <w:shd w:fill="F9FBFD"/>
+            <w:tcMar>
+              <w:top w:w="80" w:type="dxa"/>
+              <w:bottom w:w="80" w:type="dxa"/>
+              <w:left w:w="100" w:type="dxa"/>
+              <w:right w:w="100" w:type="dxa"/>
+            </w:tcMar>
+          </w:tcPr>
+          <w:p>
+            <w:pPr>
+              <w:jc w:val="left"/>
+            </w:pPr>
+            <w:r>
+              <w:rPr>
+                <w:rFonts w:ascii="Consolas" w:hAnsi="Consolas"/>
+                <w:color w:val="C0392B"/>
+                <w:sz w:val="16"/>
+              </w:rPr>
+              <w:t>gen_ai.security.cloud_armor.blocked</w:t>
+            </w:r>
+          </w:p>
+        </w:tc>
+        <w:tc>
+          <w:tcPr>
+            <w:tcW w:type="dxa" w:w="3168"/>
+            <w:shd w:fill="F9FBFD"/>
+            <w:tcMar>
+              <w:top w:w="80" w:type="dxa"/>
+              <w:bottom w:w="80" w:type="dxa"/>
+              <w:left w:w="100" w:type="dxa"/>
+              <w:right w:w="100" w:type="dxa"/>
+            </w:tcMar>
+          </w:tcPr>
+          <w:p>
+            <w:pPr>
+              <w:jc w:val="left"/>
+            </w:pPr>
+            <w:r>
+              <w:rPr>
+                <w:color w:val="2C3E50"/>
+                <w:sz w:val="17"/>
+              </w:rPr>
+              <w:t>Requests blocked by Cloud Armor policies</w:t>
+            </w:r>
+          </w:p>
+        </w:tc>
+        <w:tc>
+          <w:tcPr>
+            <w:tcW w:type="dxa" w:w="3168"/>
+            <w:shd w:fill="F9FBFD"/>
+            <w:tcMar>
+              <w:top w:w="80" w:type="dxa"/>
+              <w:bottom w:w="80" w:type="dxa"/>
+              <w:left w:w="100" w:type="dxa"/>
+              <w:right w:w="100" w:type="dxa"/>
+            </w:tcMar>
+          </w:tcPr>
+          <w:p>
+            <w:pPr>
+              <w:jc w:val="left"/>
+            </w:pPr>
+            <w:r>
+              <w:rPr>
+                <w:rFonts w:ascii="Consolas" w:hAnsi="Consolas"/>
+                <w:color w:val="34495E"/>
+                <w:sz w:val="16"/>
+              </w:rPr>
+              <w:t>Sum(Blocked requests)</w:t>
+            </w:r>
+          </w:p>
+        </w:tc>
+        <w:tc>
+          <w:tcPr>
+            <w:tcW w:type="dxa" w:w="1584"/>
+            <w:shd w:fill="F9FBFD"/>
+            <w:tcMar>
+              <w:top w:w="80" w:type="dxa"/>
+              <w:bottom w:w="80" w:type="dxa"/>
+              <w:left w:w="100" w:type="dxa"/>
+              <w:right w:w="100" w:type="dxa"/>
+            </w:tcMar>
+          </w:tcPr>
+          <w:p>
+            <w:pPr>
+              <w:jc w:val="left"/>
+            </w:pPr>
+            <w:r>
+              <w:rPr>
+                <w:b/>
+                <w:color w:val="196F3D"/>
+                <w:sz w:val="17"/>
+              </w:rPr>
+              <w:t>&lt;= 2 blocks</w:t>
+            </w:r>
+          </w:p>
+        </w:tc>
+      </w:tr>
+      <w:tr>
+        <w:tc>
+          <w:tcPr>
+            <w:tcW w:type="dxa" w:w="1728"/>
+            <w:shd w:fill="FFFFFF"/>
+            <w:tcMar>
+              <w:top w:w="80" w:type="dxa"/>
+              <w:bottom w:w="80" w:type="dxa"/>
+              <w:left w:w="100" w:type="dxa"/>
+              <w:right w:w="100" w:type="dxa"/>
+            </w:tcMar>
+          </w:tcPr>
+          <w:p>
+            <w:pPr>
+              <w:jc w:val="left"/>
+            </w:pPr>
+            <w:r>
+              <w:rPr>
+                <w:color w:val="2C3E50"/>
+                <w:sz w:val="17"/>
+              </w:rPr>
+              <w:t>Policy &amp; Governance</w:t>
+            </w:r>
+          </w:p>
+        </w:tc>
+        <w:tc>
+          <w:tcPr>
+            <w:tcW w:type="dxa" w:w="1872"/>
+            <w:shd w:fill="FFFFFF"/>
+            <w:tcMar>
+              <w:top w:w="80" w:type="dxa"/>
+              <w:bottom w:w="80" w:type="dxa"/>
+              <w:left w:w="100" w:type="dxa"/>
+              <w:right w:w="100" w:type="dxa"/>
+            </w:tcMar>
+          </w:tcPr>
+          <w:p>
+            <w:pPr>
+              <w:jc w:val="left"/>
+            </w:pPr>
+            <w:r>
+              <w:rPr>
+                <w:color w:val="2C3E50"/>
+                <w:sz w:val="17"/>
+              </w:rPr>
+              <w:t>Cloud Armor Violations</w:t>
+            </w:r>
+          </w:p>
+        </w:tc>
+        <w:tc>
+          <w:tcPr>
+            <w:tcW w:type="dxa" w:w="2880"/>
+            <w:shd w:fill="FFFFFF"/>
+            <w:tcMar>
+              <w:top w:w="80" w:type="dxa"/>
+              <w:bottom w:w="80" w:type="dxa"/>
+              <w:left w:w="100" w:type="dxa"/>
+              <w:right w:w="100" w:type="dxa"/>
+            </w:tcMar>
+          </w:tcPr>
+          <w:p>
+            <w:pPr>
+              <w:jc w:val="left"/>
+            </w:pPr>
+            <w:r>
+              <w:rPr>
+                <w:rFonts w:ascii="Consolas" w:hAnsi="Consolas"/>
+                <w:color w:val="C0392B"/>
+                <w:sz w:val="16"/>
+              </w:rPr>
+              <w:t>gen_ai.security.cloud_armor.violations</w:t>
+            </w:r>
+          </w:p>
+        </w:tc>
+        <w:tc>
+          <w:tcPr>
+            <w:tcW w:type="dxa" w:w="3168"/>
+            <w:shd w:fill="FFFFFF"/>
+            <w:tcMar>
+              <w:top w:w="80" w:type="dxa"/>
+              <w:bottom w:w="80" w:type="dxa"/>
+              <w:left w:w="100" w:type="dxa"/>
+              <w:right w:w="100" w:type="dxa"/>
+            </w:tcMar>
+          </w:tcPr>
+          <w:p>
+            <w:pPr>
+              <w:jc w:val="left"/>
+            </w:pPr>
+            <w:r>
+              <w:rPr>
+                <w:color w:val="2C3E50"/>
+                <w:sz w:val="17"/>
+              </w:rPr>
+              <w:t>SQL injection or XSS violations flagged</w:t>
+            </w:r>
+          </w:p>
+        </w:tc>
+        <w:tc>
+          <w:tcPr>
+            <w:tcW w:type="dxa" w:w="3168"/>
+            <w:shd w:fill="FFFFFF"/>
+            <w:tcMar>
+              <w:top w:w="80" w:type="dxa"/>
+              <w:bottom w:w="80" w:type="dxa"/>
+              <w:left w:w="100" w:type="dxa"/>
+              <w:right w:w="100" w:type="dxa"/>
+            </w:tcMar>
+          </w:tcPr>
+          <w:p>
+            <w:pPr>
+              <w:jc w:val="left"/>
+            </w:pPr>
+            <w:r>
+              <w:rPr>
+                <w:rFonts w:ascii="Consolas" w:hAnsi="Consolas"/>
+                <w:color w:val="34495E"/>
+                <w:sz w:val="16"/>
+              </w:rPr>
+              <w:t>Sum(Violations)</w:t>
+            </w:r>
+          </w:p>
+        </w:tc>
+        <w:tc>
+          <w:tcPr>
+            <w:tcW w:type="dxa" w:w="1584"/>
+            <w:shd w:fill="FFFFFF"/>
+            <w:tcMar>
+              <w:top w:w="80" w:type="dxa"/>
+              <w:bottom w:w="80" w:type="dxa"/>
+              <w:left w:w="100" w:type="dxa"/>
+              <w:right w:w="100" w:type="dxa"/>
+            </w:tcMar>
+          </w:tcPr>
+          <w:p>
+            <w:pPr>
+              <w:jc w:val="left"/>
+            </w:pPr>
+            <w:r>
+              <w:rPr>
+                <w:b/>
+                <w:color w:val="196F3D"/>
+                <w:sz w:val="17"/>
+              </w:rPr>
+              <w:t>== 0 violations</w:t>
+            </w:r>
+          </w:p>
+        </w:tc>
+      </w:tr>
+      <w:tr>
+        <w:tc>
+          <w:tcPr>
+            <w:tcW w:type="dxa" w:w="1728"/>
+            <w:shd w:fill="F9FBFD"/>
+            <w:tcMar>
+              <w:top w:w="80" w:type="dxa"/>
+              <w:bottom w:w="80" w:type="dxa"/>
+              <w:left w:w="100" w:type="dxa"/>
+              <w:right w:w="100" w:type="dxa"/>
+            </w:tcMar>
+          </w:tcPr>
+          <w:p>
+            <w:pPr>
+              <w:jc w:val="left"/>
+            </w:pPr>
+            <w:r>
+              <w:rPr>
+                <w:color w:val="2C3E50"/>
+                <w:sz w:val="17"/>
+              </w:rPr>
+              <w:t>Policy &amp; Governance</w:t>
+            </w:r>
+          </w:p>
+        </w:tc>
+        <w:tc>
+          <w:tcPr>
+            <w:tcW w:type="dxa" w:w="1872"/>
+            <w:shd w:fill="F9FBFD"/>
+            <w:tcMar>
+              <w:top w:w="80" w:type="dxa"/>
+              <w:bottom w:w="80" w:type="dxa"/>
+              <w:left w:w="100" w:type="dxa"/>
+              <w:right w:w="100" w:type="dxa"/>
+            </w:tcMar>
+          </w:tcPr>
+          <w:p>
+            <w:pPr>
+              <w:jc w:val="left"/>
+            </w:pPr>
+            <w:r>
+              <w:rPr>
+                <w:color w:val="2C3E50"/>
+                <w:sz w:val="17"/>
+              </w:rPr>
+              <w:t>Model Armor Prompt Injections</w:t>
+            </w:r>
+          </w:p>
+        </w:tc>
+        <w:tc>
+          <w:tcPr>
+            <w:tcW w:type="dxa" w:w="2880"/>
+            <w:shd w:fill="F9FBFD"/>
+            <w:tcMar>
+              <w:top w:w="80" w:type="dxa"/>
+              <w:bottom w:w="80" w:type="dxa"/>
+              <w:left w:w="100" w:type="dxa"/>
+              <w:right w:w="100" w:type="dxa"/>
+            </w:tcMar>
+          </w:tcPr>
+          <w:p>
+            <w:pPr>
+              <w:jc w:val="left"/>
+            </w:pPr>
+            <w:r>
+              <w:rPr>
+                <w:rFonts w:ascii="Consolas" w:hAnsi="Consolas"/>
+                <w:color w:val="C0392B"/>
+                <w:sz w:val="16"/>
+              </w:rPr>
+              <w:t>gen_ai.security.model_armor.prompt_injection</w:t>
+            </w:r>
+          </w:p>
+        </w:tc>
+        <w:tc>
+          <w:tcPr>
+            <w:tcW w:type="dxa" w:w="3168"/>
+            <w:shd w:fill="F9FBFD"/>
+            <w:tcMar>
+              <w:top w:w="80" w:type="dxa"/>
+              <w:bottom w:w="80" w:type="dxa"/>
+              <w:left w:w="100" w:type="dxa"/>
+              <w:right w:w="100" w:type="dxa"/>
+            </w:tcMar>
+          </w:tcPr>
+          <w:p>
+            <w:pPr>
+              <w:jc w:val="left"/>
+            </w:pPr>
+            <w:r>
+              <w:rPr>
+                <w:color w:val="2C3E50"/>
+                <w:sz w:val="17"/>
+              </w:rPr>
+              <w:t>Prompt injection attempts blocked by Model Armor</w:t>
+            </w:r>
+          </w:p>
+        </w:tc>
+        <w:tc>
+          <w:tcPr>
+            <w:tcW w:type="dxa" w:w="3168"/>
+            <w:shd w:fill="F9FBFD"/>
+            <w:tcMar>
+              <w:top w:w="80" w:type="dxa"/>
+              <w:bottom w:w="80" w:type="dxa"/>
+              <w:left w:w="100" w:type="dxa"/>
+              <w:right w:w="100" w:type="dxa"/>
+            </w:tcMar>
+          </w:tcPr>
+          <w:p>
+            <w:pPr>
+              <w:jc w:val="left"/>
+            </w:pPr>
+            <w:r>
+              <w:rPr>
+                <w:rFonts w:ascii="Consolas" w:hAnsi="Consolas"/>
+                <w:color w:val="34495E"/>
+                <w:sz w:val="16"/>
+              </w:rPr>
+              <w:t>Sum(Prompt injections)</w:t>
+            </w:r>
+          </w:p>
+        </w:tc>
+        <w:tc>
+          <w:tcPr>
+            <w:tcW w:type="dxa" w:w="1584"/>
+            <w:shd w:fill="F9FBFD"/>
+            <w:tcMar>
+              <w:top w:w="80" w:type="dxa"/>
+              <w:bottom w:w="80" w:type="dxa"/>
+              <w:left w:w="100" w:type="dxa"/>
+              <w:right w:w="100" w:type="dxa"/>
+            </w:tcMar>
+          </w:tcPr>
+          <w:p>
+            <w:pPr>
+              <w:jc w:val="left"/>
+            </w:pPr>
+            <w:r>
+              <w:rPr>
+                <w:b/>
+                <w:color w:val="196F3D"/>
+                <w:sz w:val="17"/>
+              </w:rPr>
+              <w:t>== 0 injections</w:t>
+            </w:r>
+          </w:p>
+        </w:tc>
+      </w:tr>
+      <w:tr>
+        <w:tc>
+          <w:tcPr>
+            <w:tcW w:type="dxa" w:w="1728"/>
+            <w:shd w:fill="FFFFFF"/>
+            <w:tcMar>
+              <w:top w:w="80" w:type="dxa"/>
+              <w:bottom w:w="80" w:type="dxa"/>
+              <w:left w:w="100" w:type="dxa"/>
+              <w:right w:w="100" w:type="dxa"/>
+            </w:tcMar>
+          </w:tcPr>
+          <w:p>
+            <w:pPr>
+              <w:jc w:val="left"/>
+            </w:pPr>
+            <w:r>
+              <w:rPr>
+                <w:color w:val="2C3E50"/>
+                <w:sz w:val="17"/>
+              </w:rPr>
+              <w:t>Policy &amp; Governance</w:t>
+            </w:r>
+          </w:p>
+        </w:tc>
+        <w:tc>
+          <w:tcPr>
+            <w:tcW w:type="dxa" w:w="1872"/>
+            <w:shd w:fill="FFFFFF"/>
+            <w:tcMar>
+              <w:top w:w="80" w:type="dxa"/>
+              <w:bottom w:w="80" w:type="dxa"/>
+              <w:left w:w="100" w:type="dxa"/>
+              <w:right w:w="100" w:type="dxa"/>
+            </w:tcMar>
+          </w:tcPr>
+          <w:p>
+            <w:pPr>
+              <w:jc w:val="left"/>
+            </w:pPr>
+            <w:r>
+              <w:rPr>
+                <w:color w:val="2C3E50"/>
+                <w:sz w:val="17"/>
+              </w:rPr>
+              <w:t>Model Armor Jailbreak Attempts</w:t>
+            </w:r>
+          </w:p>
+        </w:tc>
+        <w:tc>
+          <w:tcPr>
+            <w:tcW w:type="dxa" w:w="2880"/>
+            <w:shd w:fill="FFFFFF"/>
+            <w:tcMar>
+              <w:top w:w="80" w:type="dxa"/>
+              <w:bottom w:w="80" w:type="dxa"/>
+              <w:left w:w="100" w:type="dxa"/>
+              <w:right w:w="100" w:type="dxa"/>
+            </w:tcMar>
+          </w:tcPr>
+          <w:p>
+            <w:pPr>
+              <w:jc w:val="left"/>
+            </w:pPr>
+            <w:r>
+              <w:rPr>
+                <w:rFonts w:ascii="Consolas" w:hAnsi="Consolas"/>
+                <w:color w:val="C0392B"/>
+                <w:sz w:val="16"/>
+              </w:rPr>
+              <w:t>gen_ai.security.model_armor.jailbreak</w:t>
+            </w:r>
+          </w:p>
+        </w:tc>
+        <w:tc>
+          <w:tcPr>
+            <w:tcW w:type="dxa" w:w="3168"/>
+            <w:shd w:fill="FFFFFF"/>
+            <w:tcMar>
+              <w:top w:w="80" w:type="dxa"/>
+              <w:bottom w:w="80" w:type="dxa"/>
+              <w:left w:w="100" w:type="dxa"/>
+              <w:right w:w="100" w:type="dxa"/>
+            </w:tcMar>
+          </w:tcPr>
+          <w:p>
+            <w:pPr>
+              <w:jc w:val="left"/>
+            </w:pPr>
+            <w:r>
+              <w:rPr>
+                <w:color w:val="2C3E50"/>
+                <w:sz w:val="17"/>
+              </w:rPr>
+              <w:t>Jailbreak attempts flagged by Model Armor</w:t>
+            </w:r>
+          </w:p>
+        </w:tc>
+        <w:tc>
+          <w:tcPr>
+            <w:tcW w:type="dxa" w:w="3168"/>
+            <w:shd w:fill="FFFFFF"/>
+            <w:tcMar>
+              <w:top w:w="80" w:type="dxa"/>
+              <w:bottom w:w="80" w:type="dxa"/>
+              <w:left w:w="100" w:type="dxa"/>
+              <w:right w:w="100" w:type="dxa"/>
+            </w:tcMar>
+          </w:tcPr>
+          <w:p>
+            <w:pPr>
+              <w:jc w:val="left"/>
+            </w:pPr>
+            <w:r>
+              <w:rPr>
+                <w:rFonts w:ascii="Consolas" w:hAnsi="Consolas"/>
+                <w:color w:val="34495E"/>
+                <w:sz w:val="16"/>
+              </w:rPr>
+              <w:t>Sum(Jailbreaks)</w:t>
+            </w:r>
+          </w:p>
+        </w:tc>
+        <w:tc>
+          <w:tcPr>
+            <w:tcW w:type="dxa" w:w="1584"/>
+            <w:shd w:fill="FFFFFF"/>
+            <w:tcMar>
+              <w:top w:w="80" w:type="dxa"/>
+              <w:bottom w:w="80" w:type="dxa"/>
+              <w:left w:w="100" w:type="dxa"/>
+              <w:right w:w="100" w:type="dxa"/>
+            </w:tcMar>
+          </w:tcPr>
+          <w:p>
+            <w:pPr>
+              <w:jc w:val="left"/>
+            </w:pPr>
+            <w:r>
+              <w:rPr>
+                <w:b/>
+                <w:color w:val="196F3D"/>
+                <w:sz w:val="17"/>
+              </w:rPr>
+              <w:t>== 0 jailbreaks</w:t>
+            </w:r>
+          </w:p>
+        </w:tc>
+      </w:tr>
+      <w:tr>
+        <w:tc>
+          <w:tcPr>
+            <w:tcW w:type="dxa" w:w="1728"/>
+            <w:shd w:fill="F9FBFD"/>
+            <w:tcMar>
+              <w:top w:w="80" w:type="dxa"/>
+              <w:bottom w:w="80" w:type="dxa"/>
+              <w:left w:w="100" w:type="dxa"/>
+              <w:right w:w="100" w:type="dxa"/>
+            </w:tcMar>
+          </w:tcPr>
+          <w:p>
+            <w:pPr>
+              <w:jc w:val="left"/>
+            </w:pPr>
+            <w:r>
+              <w:rPr>
+                <w:color w:val="2C3E50"/>
+                <w:sz w:val="17"/>
+              </w:rPr>
+              <w:t>Policy &amp; Governance</w:t>
+            </w:r>
+          </w:p>
+        </w:tc>
+        <w:tc>
+          <w:tcPr>
+            <w:tcW w:type="dxa" w:w="1872"/>
+            <w:shd w:fill="F9FBFD"/>
+            <w:tcMar>
+              <w:top w:w="80" w:type="dxa"/>
+              <w:bottom w:w="80" w:type="dxa"/>
+              <w:left w:w="100" w:type="dxa"/>
+              <w:right w:w="100" w:type="dxa"/>
+            </w:tcMar>
+          </w:tcPr>
+          <w:p>
+            <w:pPr>
+              <w:jc w:val="left"/>
+            </w:pPr>
+            <w:r>
+              <w:rPr>
+                <w:color w:val="2C3E50"/>
+                <w:sz w:val="17"/>
+              </w:rPr>
+              <w:t>Model Armor PII Leak Blocks</w:t>
+            </w:r>
+          </w:p>
+        </w:tc>
+        <w:tc>
+          <w:tcPr>
+            <w:tcW w:type="dxa" w:w="2880"/>
+            <w:shd w:fill="F9FBFD"/>
+            <w:tcMar>
+              <w:top w:w="80" w:type="dxa"/>
+              <w:bottom w:w="80" w:type="dxa"/>
+              <w:left w:w="100" w:type="dxa"/>
+              <w:right w:w="100" w:type="dxa"/>
+            </w:tcMar>
+          </w:tcPr>
+          <w:p>
+            <w:pPr>
+              <w:jc w:val="left"/>
+            </w:pPr>
+            <w:r>
+              <w:rPr>
+                <w:rFonts w:ascii="Consolas" w:hAnsi="Consolas"/>
+                <w:color w:val="C0392B"/>
+                <w:sz w:val="16"/>
+              </w:rPr>
+              <w:t>gen_ai.security.model_armor.pii_leak</w:t>
+            </w:r>
+          </w:p>
+        </w:tc>
+        <w:tc>
+          <w:tcPr>
+            <w:tcW w:type="dxa" w:w="3168"/>
+            <w:shd w:fill="F9FBFD"/>
+            <w:tcMar>
+              <w:top w:w="80" w:type="dxa"/>
+              <w:bottom w:w="80" w:type="dxa"/>
+              <w:left w:w="100" w:type="dxa"/>
+              <w:right w:w="100" w:type="dxa"/>
+            </w:tcMar>
+          </w:tcPr>
+          <w:p>
+            <w:pPr>
+              <w:jc w:val="left"/>
+            </w:pPr>
+            <w:r>
+              <w:rPr>
+                <w:color w:val="2C3E50"/>
+                <w:sz w:val="17"/>
+              </w:rPr>
+              <w:t>PII leaks blocked by Model Armor filters</w:t>
+            </w:r>
+          </w:p>
+        </w:tc>
+        <w:tc>
+          <w:tcPr>
+            <w:tcW w:type="dxa" w:w="3168"/>
+            <w:shd w:fill="F9FBFD"/>
+            <w:tcMar>
+              <w:top w:w="80" w:type="dxa"/>
+              <w:bottom w:w="80" w:type="dxa"/>
+              <w:left w:w="100" w:type="dxa"/>
+              <w:right w:w="100" w:type="dxa"/>
+            </w:tcMar>
+          </w:tcPr>
+          <w:p>
+            <w:pPr>
+              <w:jc w:val="left"/>
+            </w:pPr>
+            <w:r>
+              <w:rPr>
+                <w:rFonts w:ascii="Consolas" w:hAnsi="Consolas"/>
+                <w:color w:val="34495E"/>
+                <w:sz w:val="16"/>
+              </w:rPr>
+              <w:t>Sum(PII leaks)</w:t>
+            </w:r>
+          </w:p>
+        </w:tc>
+        <w:tc>
+          <w:tcPr>
+            <w:tcW w:type="dxa" w:w="1584"/>
+            <w:shd w:fill="F9FBFD"/>
+            <w:tcMar>
+              <w:top w:w="80" w:type="dxa"/>
+              <w:bottom w:w="80" w:type="dxa"/>
+              <w:left w:w="100" w:type="dxa"/>
+              <w:right w:w="100" w:type="dxa"/>
+            </w:tcMar>
+          </w:tcPr>
+          <w:p>
+            <w:pPr>
+              <w:jc w:val="left"/>
+            </w:pPr>
+            <w:r>
+              <w:rPr>
+                <w:b/>
+                <w:color w:val="196F3D"/>
+                <w:sz w:val="17"/>
+              </w:rPr>
+              <w:t>== 0 leaks</w:t>
+            </w:r>
+          </w:p>
+        </w:tc>
+      </w:tr>
+      <w:tr>
+        <w:tc>
+          <w:tcPr>
+            <w:tcW w:type="dxa" w:w="1728"/>
+            <w:shd w:fill="FFFFFF"/>
+            <w:tcMar>
+              <w:top w:w="80" w:type="dxa"/>
+              <w:bottom w:w="80" w:type="dxa"/>
+              <w:left w:w="100" w:type="dxa"/>
+              <w:right w:w="100" w:type="dxa"/>
+            </w:tcMar>
+          </w:tcPr>
+          <w:p>
+            <w:pPr>
+              <w:jc w:val="left"/>
+            </w:pPr>
+            <w:r>
+              <w:rPr>
+                <w:color w:val="2C3E50"/>
+                <w:sz w:val="17"/>
+              </w:rPr>
+              <w:t>Policy &amp; Governance</w:t>
+            </w:r>
+          </w:p>
+        </w:tc>
+        <w:tc>
+          <w:tcPr>
+            <w:tcW w:type="dxa" w:w="1872"/>
+            <w:shd w:fill="FFFFFF"/>
+            <w:tcMar>
+              <w:top w:w="80" w:type="dxa"/>
+              <w:bottom w:w="80" w:type="dxa"/>
+              <w:left w:w="100" w:type="dxa"/>
+              <w:right w:w="100" w:type="dxa"/>
+            </w:tcMar>
+          </w:tcPr>
+          <w:p>
+            <w:pPr>
+              <w:jc w:val="left"/>
+            </w:pPr>
+            <w:r>
+              <w:rPr>
+                <w:color w:val="2C3E50"/>
+                <w:sz w:val="17"/>
+              </w:rPr>
+              <w:t>Model Armor Safety Triggers</w:t>
+            </w:r>
+          </w:p>
+        </w:tc>
+        <w:tc>
+          <w:tcPr>
+            <w:tcW w:type="dxa" w:w="2880"/>
+            <w:shd w:fill="FFFFFF"/>
+            <w:tcMar>
+              <w:top w:w="80" w:type="dxa"/>
+              <w:bottom w:w="80" w:type="dxa"/>
+              <w:left w:w="100" w:type="dxa"/>
+              <w:right w:w="100" w:type="dxa"/>
+            </w:tcMar>
+          </w:tcPr>
+          <w:p>
+            <w:pPr>
+              <w:jc w:val="left"/>
+            </w:pPr>
+            <w:r>
+              <w:rPr>
+                <w:rFonts w:ascii="Consolas" w:hAnsi="Consolas"/>
+                <w:color w:val="C0392B"/>
+                <w:sz w:val="16"/>
+              </w:rPr>
+              <w:t>gen_ai.security.model_armor.safety_triggers</w:t>
+            </w:r>
+          </w:p>
+        </w:tc>
+        <w:tc>
+          <w:tcPr>
+            <w:tcW w:type="dxa" w:w="3168"/>
+            <w:shd w:fill="FFFFFF"/>
+            <w:tcMar>
+              <w:top w:w="80" w:type="dxa"/>
+              <w:bottom w:w="80" w:type="dxa"/>
+              <w:left w:w="100" w:type="dxa"/>
+              <w:right w:w="100" w:type="dxa"/>
+            </w:tcMar>
+          </w:tcPr>
+          <w:p>
+            <w:pPr>
+              <w:jc w:val="left"/>
+            </w:pPr>
+            <w:r>
+              <w:rPr>
+                <w:color w:val="2C3E50"/>
+                <w:sz w:val="17"/>
+              </w:rPr>
+              <w:t>Toxicity, hate speech or harassment blocks</w:t>
+            </w:r>
+          </w:p>
+        </w:tc>
+        <w:tc>
+          <w:tcPr>
+            <w:tcW w:type="dxa" w:w="3168"/>
+            <w:shd w:fill="FFFFFF"/>
+            <w:tcMar>
+              <w:top w:w="80" w:type="dxa"/>
+              <w:bottom w:w="80" w:type="dxa"/>
+              <w:left w:w="100" w:type="dxa"/>
+              <w:right w:w="100" w:type="dxa"/>
+            </w:tcMar>
+          </w:tcPr>
+          <w:p>
+            <w:pPr>
+              <w:jc w:val="left"/>
+            </w:pPr>
+            <w:r>
+              <w:rPr>
+                <w:rFonts w:ascii="Consolas" w:hAnsi="Consolas"/>
+                <w:color w:val="34495E"/>
+                <w:sz w:val="16"/>
+              </w:rPr>
+              <w:t>Sum(Safety triggers)</w:t>
+            </w:r>
+          </w:p>
+        </w:tc>
+        <w:tc>
+          <w:tcPr>
+            <w:tcW w:type="dxa" w:w="1584"/>
+            <w:shd w:fill="FFFFFF"/>
+            <w:tcMar>
+              <w:top w:w="80" w:type="dxa"/>
+              <w:bottom w:w="80" w:type="dxa"/>
+              <w:left w:w="100" w:type="dxa"/>
+              <w:right w:w="100" w:type="dxa"/>
+            </w:tcMar>
+          </w:tcPr>
+          <w:p>
+            <w:pPr>
+              <w:jc w:val="left"/>
+            </w:pPr>
+            <w:r>
+              <w:rPr>
+                <w:b/>
+                <w:color w:val="196F3D"/>
+                <w:sz w:val="17"/>
+              </w:rPr>
+              <w:t>== 0 triggers</w:t>
             </w:r>
           </w:p>
         </w:tc>

</xml_diff>